<commit_message>
fix: disparador de consulta tambien valida UPDATE, ajustes de scripts y textos
</commit_message>
<xml_diff>
--- a/documentos/fase2/05_Scripts_Implementacion.docx
+++ b/documentos/fase2/05_Scripts_Implementacion.docx
@@ -2935,6 +2935,16 @@
           <w:rStyle w:val="VerbatimChar"/>
           <w:lang w:val="es-CO"/>
         </w:rPr>
+        <w:t xml:space="preserve">OK     Mover consulta a cita cancelada   ORA-20004: La cita 22 está en estado CANCELADA; solo las citas ATENDIDAS generan consulta.</w:t>
+      </w:r>
+      <w:r>
+        <w:br/>
+      </w:r>
+      <w:r>
+        <w:rPr>
+          <w:rStyle w:val="VerbatimChar"/>
+          <w:lang w:val="es-CO"/>
+        </w:rPr>
         <w:t xml:space="preserve">OK     Cambio de tipo con subtipo        ORA-20005: El empleado 1 tiene registro de subtipo; elimínelo antes de cambiar tipo_emplea</w:t>
       </w:r>
       <w:r>
@@ -3031,7 +3041,7 @@
           <w:rStyle w:val="VerbatimChar"/>
           <w:lang w:val="es-CO"/>
         </w:rPr>
-        <w:t xml:space="preserve">Elapsed: 00:00:10.10</w:t>
+        <w:t xml:space="preserve">Elapsed: 00:00:04.31</w:t>
       </w:r>
       <w:r>
         <w:br/>

</xml_diff>